<commit_message>
Update seed-round pack to Ningbo Modian entity and server snapshot wording.
Co-authored-by: Cursor <cursoragent@cursor.com>
</commit_message>
<xml_diff>
--- a/docs/seed-round-202609/一页纸-执行摘要.docx
+++ b/docs/seed-round-202609/一页纸-执行摘要.docx
@@ -33,7 +33,7 @@
           <w:b/>
           <w:bCs/>
         </w:rPr>
-        <w:t xml:space="preserve">温州灵祺智能科技有限公司</w:t>
+        <w:t xml:space="preserve">宁波墨典网络科技有限公司</w:t>
       </w:r>
       <w:r>
         <w:br/>
@@ -170,7 +170,7 @@
           <w:b/>
           <w:bCs/>
         </w:rPr>
-        <w:t xml:space="preserve">现在已经在生产环境跑着（轻量只读快照，可复核）</w:t>
+        <w:t xml:space="preserve">现在已经在生产环境跑着（服务器快照，可复核）</w:t>
       </w:r>
     </w:p>
     <w:tbl>

</xml_diff>

<commit_message>
Remove internal prompt-like wording from investor-facing seed materials.
Co-authored-by: Cursor <cursoragent@cursor.com>
</commit_message>
<xml_diff>
--- a/docs/seed-round-202609/一页纸-执行摘要.docx
+++ b/docs/seed-round-202609/一页纸-执行摘要.docx
@@ -503,7 +503,7 @@
               <w:rPr>
                 <w:rFonts w:hint="eastAsia"/>
               </w:rPr>
-              <w:t xml:space="preserve">规模化收费是本轮要打的洞</w:t>
+              <w:t xml:space="preserve">本轮重点是把用量转为经常性收入</w:t>
             </w:r>
           </w:p>
         </w:tc>
@@ -705,7 +705,7 @@
         <w:rPr>
           <w:rFonts w:hint="eastAsia"/>
         </w:rPr>
-        <w:t xml:space="preserve">对外里程碑只讲</w:t>
+        <w:t xml:space="preserve">阶段目标：M6</w:t>
       </w:r>
       <w:r>
         <w:t xml:space="preserve"> </w:t>
@@ -714,15 +714,6 @@
         <w:rPr>
           <w:rFonts w:hint="eastAsia"/>
         </w:rPr>
-        <w:t xml:space="preserve">Base：M6</w:t>
-      </w:r>
-      <w:r>
-        <w:t xml:space="preserve"> </w:t>
-      </w:r>
-      <w:r>
-        <w:rPr>
-          <w:rFonts w:hint="eastAsia"/>
-        </w:rPr>
         <w:t xml:space="preserve">付费</w:t>
       </w:r>
       <w:r>
@@ -741,25 +732,7 @@
         <w:rPr>
           <w:rFonts w:hint="eastAsia"/>
         </w:rPr>
-        <w:t xml:space="preserve">店。不承诺</w:t>
-      </w:r>
-      <w:r>
-        <w:t xml:space="preserve"> 12 </w:t>
-      </w:r>
-      <w:r>
-        <w:rPr>
-          <w:rFonts w:hint="eastAsia"/>
-        </w:rPr>
-        <w:t xml:space="preserve">个月</w:t>
-      </w:r>
-      <w:r>
-        <w:t xml:space="preserve"> 2 </w:t>
-      </w:r>
-      <w:r>
-        <w:rPr>
-          <w:rFonts w:hint="eastAsia"/>
-        </w:rPr>
-        <w:t xml:space="preserve">万店。</w:t>
+        <w:t xml:space="preserve">店。</w:t>
       </w:r>
     </w:p>
     <w:p>

</xml_diff>

<commit_message>
Recast seed ask to 4M RMB so check sizes match local funds.
Keep 5M as the oversubscribe cap, first close at 3M, and put commercialization first so institutions can actually syndicate.

Co-authored-by: Cursor <cursoragent@cursor.com>
</commit_message>
<xml_diff>
--- a/docs/seed-round-202609/一页纸-执行摘要.docx
+++ b/docs/seed-round-202609/一页纸-执行摘要.docx
@@ -78,7 +78,7 @@
           <w:b/>
           <w:bCs/>
         </w:rPr>
-        <w:t xml:space="preserve"> 500 </w:t>
+        <w:t xml:space="preserve"> 400 </w:t>
       </w:r>
       <w:r>
         <w:rPr>
@@ -89,10 +89,31 @@
         <w:t xml:space="preserve">万元</w:t>
       </w:r>
       <w:r>
-        <w:t xml:space="preserve"> </w:t>
-      </w:r>
-      <w:r>
-        <w:t xml:space="preserve">· </w:t>
+        <w:rPr>
+          <w:rFonts w:hint="eastAsia"/>
+        </w:rPr>
+        <w:t xml:space="preserve">（首次交割</w:t>
+      </w:r>
+      <w:r>
+        <w:t xml:space="preserve"> 300 </w:t>
+      </w:r>
+      <w:r>
+        <w:rPr>
+          <w:rFonts w:hint="eastAsia"/>
+        </w:rPr>
+        <w:t xml:space="preserve">万，超募上限</w:t>
+      </w:r>
+      <w:r>
+        <w:t xml:space="preserve"> 500 </w:t>
+      </w:r>
+      <w:r>
+        <w:rPr>
+          <w:rFonts w:hint="eastAsia"/>
+        </w:rPr>
+        <w:t xml:space="preserve">万）</w:t>
+      </w:r>
+      <w:r>
+        <w:t xml:space="preserve"> · </w:t>
       </w:r>
       <w:r>
         <w:rPr>
@@ -633,10 +654,10 @@
         <w:rPr>
           <w:rFonts w:hint="eastAsia"/>
         </w:rPr>
-        <w:t xml:space="preserve">研发</w:t>
-      </w:r>
-      <w:r>
-        <w:t xml:space="preserve"> 220 </w:t>
+        <w:t xml:space="preserve">商业化与渠道</w:t>
+      </w:r>
+      <w:r>
+        <w:t xml:space="preserve"> 160 </w:t>
       </w:r>
       <w:r>
         <w:rPr>
@@ -651,10 +672,10 @@
         <w:rPr>
           <w:rFonts w:hint="eastAsia"/>
         </w:rPr>
-        <w:t xml:space="preserve">交付运营</w:t>
-      </w:r>
-      <w:r>
-        <w:t xml:space="preserve"> 150 </w:t>
+        <w:t xml:space="preserve">交付与达人供给</w:t>
+      </w:r>
+      <w:r>
+        <w:t xml:space="preserve"> 100 </w:t>
       </w:r>
       <w:r>
         <w:rPr>
@@ -669,10 +690,10 @@
         <w:rPr>
           <w:rFonts w:hint="eastAsia"/>
         </w:rPr>
-        <w:t xml:space="preserve">市场销售</w:t>
-      </w:r>
-      <w:r>
-        <w:t xml:space="preserve"> 80 </w:t>
+        <w:t xml:space="preserve">研发与云资源</w:t>
+      </w:r>
+      <w:r>
+        <w:t xml:space="preserve"> 100 </w:t>
       </w:r>
       <w:r>
         <w:rPr>
@@ -687,10 +708,10 @@
         <w:rPr>
           <w:rFonts w:hint="eastAsia"/>
         </w:rPr>
-        <w:t xml:space="preserve">储备</w:t>
-      </w:r>
-      <w:r>
-        <w:t xml:space="preserve"> 50 </w:t>
+        <w:t xml:space="preserve">储备合规</w:t>
+      </w:r>
+      <w:r>
+        <w:t xml:space="preserve"> 40 </w:t>
       </w:r>
       <w:r>
         <w:rPr>
@@ -717,7 +738,7 @@
         <w:t xml:space="preserve">付费</w:t>
       </w:r>
       <w:r>
-        <w:t xml:space="preserve"> 200–500 </w:t>
+        <w:t xml:space="preserve"> 150–300 </w:t>
       </w:r>
       <w:r>
         <w:rPr>
@@ -726,7 +747,7 @@
         <w:t xml:space="preserve">店，M12</w:t>
       </w:r>
       <w:r>
-        <w:t xml:space="preserve"> 1,500–3,000 </w:t>
+        <w:t xml:space="preserve"> 800–1,500 </w:t>
       </w:r>
       <w:r>
         <w:rPr>
@@ -754,7 +775,7 @@
         <w:rPr>
           <w:rFonts w:hint="eastAsia"/>
         </w:rPr>
-        <w:t xml:space="preserve">能看懂「产品已上线、付费还薄」的早期机构：奇绩、天使湾、浙商创投、温州科创体系，以及梅花</w:t>
+        <w:t xml:space="preserve">能看懂「产品已上线、付费还薄」的早期机构：宁波天使引导基金、奇绩、天使湾、浙商创投，以及梅花</w:t>
       </w:r>
       <w:r>
         <w:t xml:space="preserve"> / </w:t>
@@ -781,16 +802,16 @@
         <w:rPr>
           <w:rFonts w:hint="eastAsia"/>
         </w:rPr>
-        <w:t xml:space="preserve">线性。浙江落地资本</w:t>
-      </w:r>
-      <w:r>
-        <w:t xml:space="preserve"> + </w:t>
-      </w:r>
-      <w:r>
-        <w:rPr>
-          <w:rFonts w:hint="eastAsia"/>
-        </w:rPr>
-        <w:t xml:space="preserve">早期品牌资本拼盘即可。</w:t>
+        <w:t xml:space="preserve">线性。2–3</w:t>
+      </w:r>
+      <w:r>
+        <w:t xml:space="preserve"> </w:t>
+      </w:r>
+      <w:r>
+        <w:rPr>
+          <w:rFonts w:hint="eastAsia"/>
+        </w:rPr>
+        <w:t xml:space="preserve">家拼盘即可。</w:t>
       </w:r>
     </w:p>
     <w:p>

</xml_diff>

<commit_message>
Remove coaching asides from investor-facing seed materials.
Replace internal cues such as “investors will ask” with formal section titles and keep founder playbooks private.

Co-authored-by: Cursor <cursoragent@cursor.com>
</commit_message>
<xml_diff>
--- a/docs/seed-round-202609/一页纸-执行摘要.docx
+++ b/docs/seed-round-202609/一页纸-执行摘要.docx
@@ -766,7 +766,7 @@
           <w:b/>
           <w:bCs/>
         </w:rPr>
-        <w:t xml:space="preserve">我们要的资方</w:t>
+        <w:t xml:space="preserve">本轮拟对接的机构</w:t>
       </w:r>
       <w:r>
         <w:br/>
@@ -775,7 +775,7 @@
         <w:rPr>
           <w:rFonts w:hint="eastAsia"/>
         </w:rPr>
-        <w:t xml:space="preserve">能看懂「产品已上线、付费还薄」的早期机构：宁波天使引导基金、奇绩、天使湾、浙商创投，以及梅花</w:t>
+        <w:t xml:space="preserve">宁波天使引导基金、奇绩、天使湾、浙商创投，以及梅花</w:t>
       </w:r>
       <w:r>
         <w:t xml:space="preserve"> / </w:t>
@@ -811,7 +811,7 @@
         <w:rPr>
           <w:rFonts w:hint="eastAsia"/>
         </w:rPr>
-        <w:t xml:space="preserve">家拼盘即可。</w:t>
+        <w:t xml:space="preserve">家共同参与即可。</w:t>
       </w:r>
     </w:p>
     <w:p>

</xml_diff>

<commit_message>
Remove unclosed fund names from the investor close slide.
The last page now states the ask and partner type, so a cold deck does not look like a name-drop list.

Co-authored-by: Cursor <cursoragent@cursor.com>
</commit_message>
<xml_diff>
--- a/docs/seed-round-202609/一页纸-执行摘要.docx
+++ b/docs/seed-round-202609/一页纸-执行摘要.docx
@@ -766,7 +766,7 @@
           <w:b/>
           <w:bCs/>
         </w:rPr>
-        <w:t xml:space="preserve">本轮拟对接的机构</w:t>
+        <w:t xml:space="preserve">本轮结构</w:t>
       </w:r>
       <w:r>
         <w:br/>
@@ -775,43 +775,43 @@
         <w:rPr>
           <w:rFonts w:hint="eastAsia"/>
         </w:rPr>
-        <w:t xml:space="preserve">宁波天使引导基金、奇绩、天使湾、浙商创投，以及梅花</w:t>
-      </w:r>
-      <w:r>
-        <w:t xml:space="preserve"> / </w:t>
-      </w:r>
-      <w:r>
-        <w:rPr>
-          <w:rFonts w:hint="eastAsia"/>
-        </w:rPr>
-        <w:t xml:space="preserve">真格</w:t>
-      </w:r>
-      <w:r>
-        <w:t xml:space="preserve"> / </w:t>
-      </w:r>
-      <w:r>
-        <w:rPr>
-          <w:rFonts w:hint="eastAsia"/>
-        </w:rPr>
-        <w:t xml:space="preserve">阿米巴</w:t>
-      </w:r>
-      <w:r>
-        <w:t xml:space="preserve"> / </w:t>
-      </w:r>
-      <w:r>
-        <w:rPr>
-          <w:rFonts w:hint="eastAsia"/>
-        </w:rPr>
-        <w:t xml:space="preserve">线性。2–3</w:t>
-      </w:r>
-      <w:r>
-        <w:t xml:space="preserve"> </w:t>
-      </w:r>
-      <w:r>
-        <w:rPr>
-          <w:rFonts w:hint="eastAsia"/>
-        </w:rPr>
-        <w:t xml:space="preserve">家共同参与即可。</w:t>
+        <w:t xml:space="preserve">目标</w:t>
+      </w:r>
+      <w:r>
+        <w:t xml:space="preserve"> 400 </w:t>
+      </w:r>
+      <w:r>
+        <w:rPr>
+          <w:rFonts w:hint="eastAsia"/>
+        </w:rPr>
+        <w:t xml:space="preserve">万，首次交割</w:t>
+      </w:r>
+      <w:r>
+        <w:t xml:space="preserve"> 300 </w:t>
+      </w:r>
+      <w:r>
+        <w:rPr>
+          <w:rFonts w:hint="eastAsia"/>
+        </w:rPr>
+        <w:t xml:space="preserve">万，超募上限</w:t>
+      </w:r>
+      <w:r>
+        <w:t xml:space="preserve"> 500 </w:t>
+      </w:r>
+      <w:r>
+        <w:rPr>
+          <w:rFonts w:hint="eastAsia"/>
+        </w:rPr>
+        <w:t xml:space="preserve">万。希望与浙江落地资本、以及认可</w:t>
+      </w:r>
+      <w:r>
+        <w:t xml:space="preserve"> AI </w:t>
+      </w:r>
+      <w:r>
+        <w:rPr>
+          <w:rFonts w:hint="eastAsia"/>
+        </w:rPr>
+        <w:t xml:space="preserve">应用落地的早期机构共同参与。</w:t>
       </w:r>
     </w:p>
     <w:p>

</xml_diff>

<commit_message>
Strip internal jargon from investor-facing seed materials.
One-pager, memo, and deck now speak in plain Chinese so SQL, table names, and ops slang do not go out with the first email.

Co-authored-by: Cursor <cursoragent@cursor.com>
</commit_message>
<xml_diff>
--- a/docs/seed-round-202609/一页纸-执行摘要.docx
+++ b/docs/seed-round-202609/一页纸-执行摘要.docx
@@ -42,16 +42,16 @@
         <w:rPr>
           <w:rFonts w:hint="eastAsia"/>
         </w:rPr>
-        <w:t xml:space="preserve">本地生活</w:t>
-      </w:r>
-      <w:r>
-        <w:t xml:space="preserve"> Merchant AI Agent + </w:t>
-      </w:r>
-      <w:r>
-        <w:rPr>
-          <w:rFonts w:hint="eastAsia"/>
-        </w:rPr>
-        <w:t xml:space="preserve">可验证达人履约网络</w:t>
+        <w:t xml:space="preserve">本地生活商家</w:t>
+      </w:r>
+      <w:r>
+        <w:t xml:space="preserve"> AI ERP + </w:t>
+      </w:r>
+      <w:r>
+        <w:rPr>
+          <w:rFonts w:hint="eastAsia"/>
+        </w:rPr>
+        <w:t xml:space="preserve">星选达人履约</w:t>
       </w:r>
       <w:r>
         <w:br/>
@@ -151,7 +151,7 @@
         <w:rPr>
           <w:rFonts w:hint="eastAsia"/>
         </w:rPr>
-        <w:t xml:space="preserve">左边是商家</w:t>
+        <w:t xml:space="preserve">一边是商家</w:t>
       </w:r>
       <w:r>
         <w:t xml:space="preserve"> / </w:t>
@@ -169,16 +169,16 @@
         <w:rPr>
           <w:rFonts w:hint="eastAsia"/>
         </w:rPr>
-        <w:t xml:space="preserve">ERP（组品、Brief、店铺分析、短视频），右边是星选达人履约网（招募、报名、探店</w:t>
-      </w:r>
-      <w:r>
-        <w:t xml:space="preserve"> / </w:t>
-      </w:r>
-      <w:r>
-        <w:rPr>
-          <w:rFonts w:hint="eastAsia"/>
-        </w:rPr>
-        <w:t xml:space="preserve">云剪、回链、结算）。中间用运营注册表打通。不是通告墙，也不是高客单代运营公司。</w:t>
+        <w:t xml:space="preserve">ERP：用</w:t>
+      </w:r>
+      <w:r>
+        <w:t xml:space="preserve"> AI </w:t>
+      </w:r>
+      <w:r>
+        <w:rPr>
+          <w:rFonts w:hint="eastAsia"/>
+        </w:rPr>
+        <w:t xml:space="preserve">组品、分析店铺、做短视频，商户确认后再写入系统。一边是星选达人履约：招募、报名、探店或云剪、回传、结算。两边在同一套系统里。不是只发招募、不管经营，也不是高客单代运营公司。</w:t>
       </w:r>
     </w:p>
     <w:p>
@@ -191,7 +191,7 @@
           <w:b/>
           <w:bCs/>
         </w:rPr>
-        <w:t xml:space="preserve">现在已经在生产环境跑着（服务器快照，可复核）</w:t>
+        <w:t xml:space="preserve">现在已经在线上跑着（生产环境数字，可当面复核）</w:t>
       </w:r>
     </w:p>
     <w:tbl>
@@ -220,7 +220,7 @@
               <w:rPr>
                 <w:rFonts w:hint="eastAsia"/>
               </w:rPr>
-              <w:t xml:space="preserve">租户</w:t>
+              <w:t xml:space="preserve">客户</w:t>
             </w:r>
             <w:r>
               <w:t xml:space="preserve"> </w:t>
@@ -229,7 +229,7 @@
               <w:rPr>
                 <w:rFonts w:hint="eastAsia"/>
               </w:rPr>
-              <w:t xml:space="preserve">32（具名主体约</w:t>
+              <w:t xml:space="preserve">32（具名约</w:t>
             </w:r>
             <w:r>
               <w:t xml:space="preserve"> </w:t>
@@ -238,7 +238,7 @@
               <w:rPr>
                 <w:rFonts w:hint="eastAsia"/>
               </w:rPr>
-              <w:t xml:space="preserve">14，服务商版</w:t>
+              <w:t xml:space="preserve">14，服务商</w:t>
             </w:r>
             <w:r>
               <w:t xml:space="preserve"> </w:t>
@@ -344,16 +344,16 @@
               <w:rPr>
                 <w:rFonts w:hint="eastAsia"/>
               </w:rPr>
-              <w:t xml:space="preserve">同步</w:t>
-            </w:r>
-            <w:r>
-              <w:t xml:space="preserve"> GMV 733 </w:t>
-            </w:r>
-            <w:r>
-              <w:rPr>
-                <w:rFonts w:hint="eastAsia"/>
-              </w:rPr>
-              <w:t xml:space="preserve">万（平台成交，非公司收入）</w:t>
+              <w:t xml:space="preserve">平台成交</w:t>
+            </w:r>
+            <w:r>
+              <w:t xml:space="preserve"> 733 </w:t>
+            </w:r>
+            <w:r>
+              <w:rPr>
+                <w:rFonts w:hint="eastAsia"/>
+              </w:rPr>
+              <w:t xml:space="preserve">万（商户成交，不是公司收入）</w:t>
             </w:r>
           </w:p>
         </w:tc>
@@ -376,10 +376,7 @@
               <w:rPr>
                 <w:rFonts w:hint="eastAsia"/>
               </w:rPr>
-              <w:t xml:space="preserve">个</w:t>
-            </w:r>
-            <w:r>
-              <w:t xml:space="preserve"> POI</w:t>
+              <w:t xml:space="preserve">个门店点位</w:t>
             </w:r>
           </w:p>
         </w:tc>
@@ -392,25 +389,22 @@
               <w:pStyle w:val="Compact"/>
             </w:pPr>
             <w:r>
-              <w:t xml:space="preserve">AI 6,397 </w:t>
+              <w:t xml:space="preserve">AI </w:t>
+            </w:r>
+            <w:r>
+              <w:rPr>
+                <w:rFonts w:hint="eastAsia"/>
+              </w:rPr>
+              <w:t xml:space="preserve">调用</w:t>
+            </w:r>
+            <w:r>
+              <w:t xml:space="preserve"> 6,397 </w:t>
             </w:r>
             <w:r>
               <w:rPr>
                 <w:rFonts w:hint="eastAsia"/>
               </w:rPr>
               <w:t xml:space="preserve">次</w:t>
-            </w:r>
-            <w:r>
-              <w:t xml:space="preserve"> / 1,224 </w:t>
-            </w:r>
-            <w:r>
-              <w:rPr>
-                <w:rFonts w:hint="eastAsia"/>
-              </w:rPr>
-              <w:t xml:space="preserve">万</w:t>
-            </w:r>
-            <w:r>
-              <w:t xml:space="preserve"> Token</w:t>
             </w:r>
           </w:p>
         </w:tc>
@@ -424,10 +418,16 @@
               <w:rPr>
                 <w:rFonts w:hint="eastAsia"/>
               </w:rPr>
-              <w:t xml:space="preserve">登录会话</w:t>
-            </w:r>
-            <w:r>
-              <w:t xml:space="preserve"> 1,992</w:t>
+              <w:t xml:space="preserve">登录</w:t>
+            </w:r>
+            <w:r>
+              <w:t xml:space="preserve"> 1,992 </w:t>
+            </w:r>
+            <w:r>
+              <w:rPr>
+                <w:rFonts w:hint="eastAsia"/>
+              </w:rPr>
+              <w:t xml:space="preserve">次</w:t>
             </w:r>
           </w:p>
         </w:tc>
@@ -438,13 +438,19 @@
               <w:pStyle w:val="Compact"/>
             </w:pPr>
             <w:r>
-              <w:t xml:space="preserve">API 212 </w:t>
-            </w:r>
-            <w:r>
-              <w:rPr>
-                <w:rFonts w:hint="eastAsia"/>
-              </w:rPr>
-              <w:t xml:space="preserve">条，主机连续运行</w:t>
+              <w:rPr>
+                <w:rFonts w:hint="eastAsia"/>
+              </w:rPr>
+              <w:t xml:space="preserve">线上接口</w:t>
+            </w:r>
+            <w:r>
+              <w:t xml:space="preserve"> 212 </w:t>
+            </w:r>
+            <w:r>
+              <w:rPr>
+                <w:rFonts w:hint="eastAsia"/>
+              </w:rPr>
+              <w:t xml:space="preserve">条，服务器连续运行</w:t>
             </w:r>
             <w:r>
               <w:t xml:space="preserve"> 100 </w:t>
@@ -524,7 +530,7 @@
               <w:rPr>
                 <w:rFonts w:hint="eastAsia"/>
               </w:rPr>
-              <w:t xml:space="preserve">本轮重点是把用量转为经常性收入</w:t>
+              <w:t xml:space="preserve">本轮重点是把现有用量做成经常性收入</w:t>
             </w:r>
           </w:p>
         </w:tc>
@@ -547,7 +553,7 @@
         <w:rPr>
           <w:rFonts w:hint="eastAsia"/>
         </w:rPr>
-        <w:t xml:space="preserve">万，≥10</w:t>
+        <w:t xml:space="preserve">万，10</w:t>
       </w:r>
       <w:r>
         <w:t xml:space="preserve"> </w:t>
@@ -556,7 +562,7 @@
         <w:rPr>
           <w:rFonts w:hint="eastAsia"/>
         </w:rPr>
-        <w:t xml:space="preserve">万粉</w:t>
+        <w:t xml:space="preserve">万粉以上</w:t>
       </w:r>
       <w:r>
         <w:t xml:space="preserve"> 170 </w:t>
@@ -574,7 +580,7 @@
         <w:rPr>
           <w:rFonts w:hint="eastAsia"/>
         </w:rPr>
-        <w:t xml:space="preserve">名会员，供给密度可做单城样板。</w:t>
+        <w:t xml:space="preserve">名会员，一座城市的达人供给已经能看出来。</w:t>
       </w:r>
     </w:p>
     <w:p>
@@ -605,16 +611,7 @@
         <w:rPr>
           <w:rFonts w:hint="eastAsia"/>
         </w:rPr>
-        <w:t xml:space="preserve">方案</w:t>
-      </w:r>
-      <w:r>
-        <w:t xml:space="preserve"> + </w:t>
-      </w:r>
-      <w:r>
-        <w:rPr>
-          <w:rFonts w:hint="eastAsia"/>
-        </w:rPr>
-        <w:t xml:space="preserve">系统执行」第一次接近真实工作流；解决方案市场仍极度分散（前五大合计约</w:t>
+        <w:t xml:space="preserve">出方案、系统去执行」第一次能用在真实经营里。解决方案市场仍极度分散（前五大合计约</w:t>
       </w:r>
       <w:r>
         <w:t xml:space="preserve"> </w:t>
@@ -632,7 +629,7 @@
         <w:rPr>
           <w:rFonts w:hint="eastAsia"/>
         </w:rPr>
-        <w:t xml:space="preserve">个月，拼的是区域密度，不是全国烧钱。</w:t>
+        <w:t xml:space="preserve">个月，先把杭甬温做深，不是全国烧钱。</w:t>
       </w:r>
     </w:p>
     <w:p>

</xml_diff>